<commit_message>
Keep Chinese Word resumes compact and preserve project content checks
</commit_message>
<xml_diff>
--- a/assets/word-resume/zh.docx
+++ b/assets/word-resume/zh.docx
@@ -748,10 +748,10 @@
       <w:jc w:val="left"/>
     </w:pPr>
     <w:rPr>
-      <w:rFonts w:ascii="Times New Roman" w:hAnsi="Times New Roman" w:eastAsia="宋体"/>
+      <w:rFonts w:ascii="Times New Roman" w:hAnsi="Times New Roman" w:eastAsia="Songti SC"/>
       <w:b w:val="0"/>
       <w:color w:val="000000"/>
-      <w:sz w:val="22"/>
+      <w:sz w:val="20"/>
     </w:rPr>
   </w:style>
   <w:style w:type="paragraph" w:styleId="Header">
@@ -817,7 +817,7 @@
       </w:pBdr>
     </w:pPr>
     <w:rPr>
-      <w:rFonts w:asciiTheme="majorHAnsi" w:eastAsiaTheme="majorEastAsia" w:hAnsiTheme="majorHAnsi" w:cstheme="majorBidi" w:ascii="Times New Roman" w:hAnsi="Times New Roman" w:eastAsia="宋体"/>
+      <w:rFonts w:asciiTheme="majorHAnsi" w:eastAsiaTheme="majorEastAsia" w:hAnsiTheme="majorHAnsi" w:cstheme="majorBidi" w:ascii="Times New Roman" w:hAnsi="Times New Roman" w:eastAsia="Songti SC"/>
       <w:b/>
       <w:bCs/>
       <w:color w:val="000000"/>
@@ -1104,7 +1104,7 @@
       <w:jc w:val="center"/>
     </w:pPr>
     <w:rPr>
-      <w:rFonts w:asciiTheme="majorHAnsi" w:eastAsiaTheme="majorEastAsia" w:hAnsiTheme="majorHAnsi" w:cstheme="majorBidi" w:ascii="Times New Roman" w:hAnsi="Times New Roman" w:eastAsia="宋体"/>
+      <w:rFonts w:asciiTheme="majorHAnsi" w:eastAsiaTheme="majorEastAsia" w:hAnsiTheme="majorHAnsi" w:cstheme="majorBidi" w:ascii="Times New Roman" w:hAnsi="Times New Roman" w:eastAsia="Songti SC"/>
       <w:b/>
       <w:color w:val="000000"/>
       <w:spacing w:val="5"/>
@@ -1289,10 +1289,10 @@
       <w:jc w:val="left"/>
     </w:pPr>
     <w:rPr>
-      <w:rFonts w:ascii="Times New Roman" w:hAnsi="Times New Roman" w:eastAsia="宋体"/>
+      <w:rFonts w:ascii="Times New Roman" w:hAnsi="Times New Roman" w:eastAsia="Songti SC"/>
       <w:b w:val="0"/>
       <w:color w:val="000000"/>
-      <w:sz w:val="22"/>
+      <w:sz w:val="20"/>
     </w:rPr>
   </w:style>
   <w:style w:type="paragraph" w:styleId="ListBullet2">

</xml_diff>

<commit_message>
Organize client documents and use consistent resume typography
</commit_message>
<xml_diff>
--- a/assets/word-resume/zh.docx
+++ b/assets/word-resume/zh.docx
@@ -748,10 +748,10 @@
       <w:jc w:val="left"/>
     </w:pPr>
     <w:rPr>
-      <w:rFonts w:ascii="Times New Roman" w:hAnsi="Times New Roman" w:eastAsia="Songti SC"/>
+      <w:rFonts w:ascii="Times New Roman" w:hAnsi="Times New Roman" w:eastAsia="SimSun"/>
       <w:b w:val="0"/>
       <w:color w:val="000000"/>
-      <w:sz w:val="20"/>
+      <w:sz w:val="22"/>
     </w:rPr>
   </w:style>
   <w:style w:type="paragraph" w:styleId="Header">
@@ -817,7 +817,7 @@
       </w:pBdr>
     </w:pPr>
     <w:rPr>
-      <w:rFonts w:asciiTheme="majorHAnsi" w:eastAsiaTheme="majorEastAsia" w:hAnsiTheme="majorHAnsi" w:cstheme="majorBidi" w:ascii="Times New Roman" w:hAnsi="Times New Roman" w:eastAsia="Songti SC"/>
+      <w:rFonts w:ascii="Times New Roman" w:hAnsi="Times New Roman" w:eastAsia="SimSun"/>
       <w:b/>
       <w:bCs/>
       <w:color w:val="000000"/>
@@ -1104,7 +1104,7 @@
       <w:jc w:val="center"/>
     </w:pPr>
     <w:rPr>
-      <w:rFonts w:asciiTheme="majorHAnsi" w:eastAsiaTheme="majorEastAsia" w:hAnsiTheme="majorHAnsi" w:cstheme="majorBidi" w:ascii="Times New Roman" w:hAnsi="Times New Roman" w:eastAsia="Songti SC"/>
+      <w:rFonts w:ascii="Times New Roman" w:hAnsi="Times New Roman" w:eastAsia="SimSun"/>
       <w:b/>
       <w:color w:val="000000"/>
       <w:spacing w:val="5"/>
@@ -1289,10 +1289,10 @@
       <w:jc w:val="left"/>
     </w:pPr>
     <w:rPr>
-      <w:rFonts w:ascii="Times New Roman" w:hAnsi="Times New Roman" w:eastAsia="Songti SC"/>
+      <w:rFonts w:ascii="Times New Roman" w:hAnsi="Times New Roman" w:eastAsia="SimSun"/>
       <w:b w:val="0"/>
       <w:color w:val="000000"/>
-      <w:sz w:val="20"/>
+      <w:sz w:val="22"/>
     </w:rPr>
   </w:style>
   <w:style w:type="paragraph" w:styleId="ListBullet2">

</xml_diff>